<commit_message>
Fix QR Contratos Aprendizaje - Diaco y Cyrgo
</commit_message>
<xml_diff>
--- a/webapp/templates/word/Kit_Retiro_Cyrgo.docx
+++ b/webapp/templates/word/Kit_Retiro_Cyrgo.docx
@@ -465,7 +465,6 @@
         <w:jc w:val="both"/>
         <w:textAlignment w:val="baseline"/>
         <w:rPr>
-          <w:rStyle w:val="eop"/>
           <w:rFonts w:ascii="Arial" w:hAnsi="Arial" w:cs="Arial"/>
         </w:rPr>
       </w:pPr>
@@ -474,23 +473,23 @@
       <w:pPr>
         <w:pStyle w:val="paragraph"/>
         <w:spacing w:before="0" w:beforeAutospacing="0" w:after="0" w:afterAutospacing="0"/>
-        <w:ind w:left="720"/>
         <w:jc w:val="center"/>
         <w:textAlignment w:val="baseline"/>
         <w:rPr>
           <w:rFonts w:ascii="Arial" w:hAnsi="Arial" w:cs="Arial"/>
-        </w:rPr>
-      </w:pPr>
-      <w:r>
-        <w:rPr>
-          <w:rFonts w:ascii="Arial" w:hAnsi="Arial" w:cs="Arial"/>
+          <w:sz w:val="18"/>
+          <w:szCs w:val="18"/>
+        </w:rPr>
+      </w:pPr>
+      <w:r>
+        <w:rPr>
           <w:noProof/>
         </w:rPr>
         <w:drawing>
-          <wp:inline distT="0" distB="0" distL="0" distR="0" wp14:anchorId="3574933F" wp14:editId="122BA1C7">
-            <wp:extent cx="1619250" cy="1633089"/>
-            <wp:effectExtent l="0" t="0" r="0" b="5715"/>
-            <wp:docPr id="2080132239" name="Imagen 1" descr="Código QR&#10;&#10;Descripción generada automáticamente"/>
+          <wp:inline distT="0" distB="0" distL="0" distR="0" wp14:anchorId="4FF9A14E" wp14:editId="3DCAF32B">
+            <wp:extent cx="1943100" cy="1943100"/>
+            <wp:effectExtent l="0" t="0" r="0" b="0"/>
+            <wp:docPr id="3" name="Imagen 3"/>
             <wp:cNvGraphicFramePr>
               <a:graphicFrameLocks xmlns:a="http://schemas.openxmlformats.org/drawingml/2006/main" noChangeAspect="1"/>
             </wp:cNvGraphicFramePr>
@@ -498,13 +497,13 @@
               <a:graphicData uri="http://schemas.openxmlformats.org/drawingml/2006/picture">
                 <pic:pic xmlns:pic="http://schemas.openxmlformats.org/drawingml/2006/picture">
                   <pic:nvPicPr>
-                    <pic:cNvPr id="2080132239" name="Imagen 1" descr="Código QR&#10;&#10;Descripción generada automáticamente"/>
+                    <pic:cNvPr id="0" name="Picture 1"/>
                     <pic:cNvPicPr>
                       <a:picLocks noChangeAspect="1" noChangeArrowheads="1"/>
                     </pic:cNvPicPr>
                   </pic:nvPicPr>
                   <pic:blipFill>
-                    <a:blip r:embed="rId11">
+                    <a:blip r:embed="rId11" cstate="print">
                       <a:extLst>
                         <a:ext uri="{28A0092B-C50C-407E-A947-70E740481C1C}">
                           <a14:useLocalDpi xmlns:a14="http://schemas.microsoft.com/office/drawing/2010/main" val="0"/>
@@ -519,7 +518,7 @@
                   <pic:spPr bwMode="auto">
                     <a:xfrm>
                       <a:off x="0" y="0"/>
-                      <a:ext cx="1629980" cy="1643910"/>
+                      <a:ext cx="1943100" cy="1943100"/>
                     </a:xfrm>
                     <a:prstGeom prst="rect">
                       <a:avLst/>
@@ -534,27 +533,6 @@
             </a:graphic>
           </wp:inline>
         </w:drawing>
-      </w:r>
-    </w:p>
-    <w:p>
-      <w:pPr>
-        <w:pStyle w:val="paragraph"/>
-        <w:spacing w:before="0" w:beforeAutospacing="0" w:after="0" w:afterAutospacing="0"/>
-        <w:textAlignment w:val="baseline"/>
-        <w:rPr>
-          <w:rFonts w:ascii="Arial" w:hAnsi="Arial" w:cs="Arial"/>
-          <w:sz w:val="18"/>
-          <w:szCs w:val="18"/>
-        </w:rPr>
-      </w:pPr>
-      <w:r>
-        <w:rPr>
-          <w:rStyle w:val="eop"/>
-          <w:rFonts w:ascii="Arial" w:hAnsi="Arial" w:cs="Arial"/>
-          <w:sz w:val="22"/>
-          <w:szCs w:val="22"/>
-        </w:rPr>
-        <w:t> </w:t>
       </w:r>
     </w:p>
     <w:p>
@@ -5031,7 +5009,7 @@
             </wp:anchor>
           </w:drawing>
         </mc:Choice>
-        <mc:Fallback xmlns:w16sdtfl="http://schemas.microsoft.com/office/word/2024/wordml/sdtformatlock" xmlns:w16du="http://schemas.microsoft.com/office/word/2023/wordml/word16du">
+        <mc:Fallback xmlns:w16du="http://schemas.microsoft.com/office/word/2023/wordml/word16du" xmlns:w16sdtfl="http://schemas.microsoft.com/office/word/2024/wordml/sdtformatlock">
           <w:pict>
             <v:shape w14:anchorId="5D149024" id="Freeform 2" o:spid="_x0000_s1026" style="position:absolute;margin-left:340pt;margin-top:-12.05pt;width:146.5pt;height:43.5pt;z-index:251661313;visibility:visible;mso-wrap-style:square;mso-width-percent:0;mso-height-percent:0;mso-wrap-distance-left:9pt;mso-wrap-distance-top:0;mso-wrap-distance-right:9pt;mso-wrap-distance-bottom:0;mso-position-horizontal:absolute;mso-position-horizontal-relative:text;mso-position-vertical:absolute;mso-position-vertical-relative:text;mso-width-percent:0;mso-height-percent:0;mso-width-relative:margin;mso-height-relative:margin;v-text-anchor:top" coordsize="9718609,3119485" o:gfxdata="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" path="m,l9718608,r,3119485l,3119485,,xe" stroked="f">
               <v:fill r:id="rId2" o:title="" recolor="t" rotate="t" type="frame"/>
@@ -7069,6 +7047,7 @@
   <w:style w:type="character" w:default="1" w:styleId="Fuentedeprrafopredeter">
     <w:name w:val="Default Paragraph Font"/>
     <w:uiPriority w:val="1"/>
+    <w:semiHidden/>
     <w:unhideWhenUsed/>
   </w:style>
   <w:style w:type="table" w:default="1" w:styleId="Tablanormal">
@@ -7590,6 +7569,19 @@
 </file>
 
 <file path=customXml/item1.xml><?xml version="1.0" encoding="utf-8"?>
+<?mso-contentType ?>
+<FormTemplates xmlns="http://schemas.microsoft.com/sharepoint/v3/contenttype/forms">
+  <Display>DocumentLibraryForm</Display>
+  <Edit>DocumentLibraryForm</Edit>
+  <New>DocumentLibraryForm</New>
+</FormTemplates>
+</file>
+
+<file path=customXml/item2.xml><?xml version="1.0" encoding="utf-8"?>
+<b:Sources xmlns:b="http://schemas.openxmlformats.org/officeDocument/2006/bibliography" xmlns="http://schemas.openxmlformats.org/officeDocument/2006/bibliography" SelectedStyle="/APA.XSL" StyleName="APA"/>
+</file>
+
+<file path=customXml/item3.xml><?xml version="1.0" encoding="utf-8"?>
 <p:properties xmlns:p="http://schemas.microsoft.com/office/2006/metadata/properties" xmlns:xsi="http://www.w3.org/2001/XMLSchema-instance" xmlns:pc="http://schemas.microsoft.com/office/infopath/2007/PartnerControls">
   <documentManagement>
     <TaxCatchAll xmlns="b2096eb7-be9a-4a41-95ed-e22c6e0c9b2e" xsi:nil="true"/>
@@ -7598,19 +7590,6 @@
     </lcf76f155ced4ddcb4097134ff3c332f>
   </documentManagement>
 </p:properties>
-</file>
-
-<file path=customXml/item2.xml><?xml version="1.0" encoding="utf-8"?>
-<b:Sources xmlns:b="http://schemas.openxmlformats.org/officeDocument/2006/bibliography" xmlns="http://schemas.openxmlformats.org/officeDocument/2006/bibliography" SelectedStyle="/APA.XSL" StyleName="APA"/>
-</file>
-
-<file path=customXml/item3.xml><?xml version="1.0" encoding="utf-8"?>
-<?mso-contentType ?>
-<FormTemplates xmlns="http://schemas.microsoft.com/sharepoint/v3/contenttype/forms">
-  <Display>DocumentLibraryForm</Display>
-  <Edit>DocumentLibraryForm</Edit>
-  <New>DocumentLibraryForm</New>
-</FormTemplates>
 </file>
 
 <file path=customXml/item4.xml><?xml version="1.0" encoding="utf-8"?>
@@ -7815,12 +7794,9 @@
 </file>
 
 <file path=customXml/itemProps1.xml><?xml version="1.0" encoding="utf-8"?>
-<ds:datastoreItem xmlns:ds="http://schemas.openxmlformats.org/officeDocument/2006/customXml" ds:itemID="{F1A2D428-D200-4FCD-A0D5-80E4610E0BDF}">
+<ds:datastoreItem xmlns:ds="http://schemas.openxmlformats.org/officeDocument/2006/customXml" ds:itemID="{5CA9D0C0-EF02-4769-92A1-8F4FB59731F3}">
   <ds:schemaRefs>
-    <ds:schemaRef ds:uri="http://schemas.microsoft.com/office/2006/metadata/properties"/>
-    <ds:schemaRef ds:uri="http://schemas.microsoft.com/office/infopath/2007/PartnerControls"/>
-    <ds:schemaRef ds:uri="b2096eb7-be9a-4a41-95ed-e22c6e0c9b2e"/>
-    <ds:schemaRef ds:uri="28133770-a4b4-44e2-905e-430bf6862a94"/>
+    <ds:schemaRef ds:uri="http://schemas.microsoft.com/sharepoint/v3/contenttype/forms"/>
   </ds:schemaRefs>
 </ds:datastoreItem>
 </file>
@@ -7834,9 +7810,12 @@
 </file>
 
 <file path=customXml/itemProps3.xml><?xml version="1.0" encoding="utf-8"?>
-<ds:datastoreItem xmlns:ds="http://schemas.openxmlformats.org/officeDocument/2006/customXml" ds:itemID="{5CA9D0C0-EF02-4769-92A1-8F4FB59731F3}">
+<ds:datastoreItem xmlns:ds="http://schemas.openxmlformats.org/officeDocument/2006/customXml" ds:itemID="{F1A2D428-D200-4FCD-A0D5-80E4610E0BDF}">
   <ds:schemaRefs>
-    <ds:schemaRef ds:uri="http://schemas.microsoft.com/sharepoint/v3/contenttype/forms"/>
+    <ds:schemaRef ds:uri="http://schemas.microsoft.com/office/2006/metadata/properties"/>
+    <ds:schemaRef ds:uri="http://schemas.microsoft.com/office/infopath/2007/PartnerControls"/>
+    <ds:schemaRef ds:uri="b2096eb7-be9a-4a41-95ed-e22c6e0c9b2e"/>
+    <ds:schemaRef ds:uri="28133770-a4b4-44e2-905e-430bf6862a94"/>
   </ds:schemaRefs>
 </ds:datastoreItem>
 </file>

</xml_diff>